<commit_message>
Modernize EMS UI and Docker health checks
</commit_message>
<xml_diff>
--- a/docs/docx/deployment.docx
+++ b/docs/docx/deployment.docx
@@ -278,6 +278,22 @@
       </w:r>
       <w:r>
         <w:t xml:space="preserve"> rebuilds the Frappe asset symlink layout and repairs stale bundle entries.</w:t>
+      </w:r>
+    </w:p>
+    <w:p>
+      <w:pPr>
+        <w:pStyle w:val="ListBullet"/>
+      </w:pPr>
+      <w:r>
+        <w:rPr>
+          <w:rFonts w:ascii="Consolas" w:hAnsi="Consolas"/>
+          <w:color w:val="144870"/>
+          <w:sz w:val="19"/>
+        </w:rPr>
+        <w:t>check-docker-services.sh</w:t>
+      </w:r>
+      <w:r>
+        <w:t xml:space="preserve"> validates Docker Compose configuration and container-to-container connectivity.</w:t>
       </w:r>
     </w:p>
     <w:p>

</xml_diff>